<commit_message>
Add five cited chapters from fundamentals to advanced.
Routing, forecasting, Contact Lens, CRM and CPaaS, and the ecosystem now have menu rows, chapter pages, and rooms whose numbers come from pages opened in October 2026. Home counts stay tied to the files the build writes.

Co-authored-by: CYPHER0X9 <cipher0x9@users.noreply.github.com>
</commit_message>
<xml_diff>
--- a/downloads/templates/routing-profile.docx
+++ b/downloads/templates/routing-profile.docx
@@ -13,7 +13,7 @@
     <w:p>
       <w:r>
         <w:rPr/>
-        <w:t xml:space="preserve">This is an independent, free, learning-only student project. It respects every company and vendor. Trademarks belong to their owners. It is not affiliated with or endorsed by Amazon Web Services, Cisco, Genesys, or any other company. If you have a concern, the page will be removed or corrected promptly through the contact form. Nothing here is sold. There are no ads. The author is happy to volunteer for any organization.</w:t>
+        <w:t xml:space="preserve">This is an independent, free, learning-only student project. It respects every company and vendor. Trademarks belong to their owners. It is not affiliated with or endorsed by Amazon Web Services, Cisco, Genesys, Salesforce, Twilio, or any other company. If you have a concern, the page will be removed or corrected promptly through the contact form. Nothing here is sold. There are no ads. The author is happy to volunteer for any organization.</w:t>
       </w:r>
     </w:p>
     <w:p>
@@ -145,6 +145,42 @@
     <w:p>
       <w:r>
         <w:rPr/>
+        <w:t xml:space="preserve">Proficiencies filter inside a queue</w:t>
+      </w:r>
+    </w:p>
+    <w:p>
+      <w:r>
+        <w:rPr/>
+        <w:t xml:space="preserve">Proficiency routing is documented for voice, chat, task, and email.</w:t>
+      </w:r>
+    </w:p>
+    <w:p>
+      <w:r>
+        <w:rPr/>
+        <w:t xml:space="preserve">AND and OR are the Boolean operators. Comparison is &gt;=, or a range of levels from 1 to 5.</w:t>
+      </w:r>
+    </w:p>
+    <w:p>
+      <w:r>
+        <w:rPr/>
+        <w:t xml:space="preserve">The same attribute cannot appear more than once in one expression.</w:t>
+      </w:r>
+    </w:p>
+    <w:p>
+      <w:r>
+        <w:rPr/>
+        <w:t xml:space="preserve">A custom predefined-attribute name cannot start with aws: or connect:.</w:t>
+      </w:r>
+    </w:p>
+    <w:p>
+      <w:r>
+        <w:rPr/>
+        <w:t xml:space="preserve">Caution: Deleting the queue because a proficiency should be enough. The criteria never runs until the contact is in a queue.</w:t>
+      </w:r>
+    </w:p>
+    <w:p>
+      <w:r>
+        <w:rPr/>
         <w:t xml:space="preserve">Sources and go deeper</w:t>
       </w:r>
     </w:p>
@@ -176,6 +212,24 @@
       <w:r>
         <w:rPr/>
         <w:t xml:space="preserve">Automatic call distributor - Wikipedia (Wikipedia) https://en.wikipedia.org/wiki/Automatic_call_distributor last checked 2026-10</w:t>
+      </w:r>
+    </w:p>
+    <w:p>
+      <w:r>
+        <w:rPr/>
+        <w:t xml:space="preserve">Set up routing in Connect Customer based on agent proficiencies - Amazon Connect Customer (AWS docs) https://docs.aws.amazon.com/connect/latest/adminguide/proficiency-routing.html last checked 2026-10</w:t>
+      </w:r>
+    </w:p>
+    <w:p>
+      <w:r>
+        <w:rPr/>
+        <w:t xml:space="preserve">Flow block in Connect Customer: Set routing criteria - Amazon Connect Customer (AWS docs) https://docs.aws.amazon.com/connect/latest/adminguide/set-routing-criteria.html last checked 2026-10</w:t>
+      </w:r>
+    </w:p>
+    <w:p>
+      <w:r>
+        <w:rPr/>
+        <w:t xml:space="preserve">Create a routing profile in Connect Customer to link queues to agents - Amazon Connect Customer (AWS docs) https://docs.aws.amazon.com/connect/latest/adminguide/routing-profiles.html last checked 2026-10</w:t>
       </w:r>
     </w:p>
   </w:body>

</xml_diff>

<commit_message>
Add five cited chapters from fundamentals to advanced. (#9)
Routing, forecasting, Contact Lens, CRM and CPaaS, and the ecosystem now have menu rows, chapter pages, and rooms whose numbers come from pages opened in October 2026. Home counts stay tied to the files the build writes.

Co-authored-by: Cursor Agent <cursoragent@cursor.com>
Co-authored-by: CYPHER0X9 <cipher0x9@users.noreply.github.com>
</commit_message>
<xml_diff>
--- a/downloads/templates/routing-profile.docx
+++ b/downloads/templates/routing-profile.docx
@@ -13,7 +13,7 @@
     <w:p>
       <w:r>
         <w:rPr/>
-        <w:t xml:space="preserve">This is an independent, free, learning-only student project. It respects every company and vendor. Trademarks belong to their owners. It is not affiliated with or endorsed by Amazon Web Services, Cisco, Genesys, or any other company. If you have a concern, the page will be removed or corrected promptly through the contact form. Nothing here is sold. There are no ads. The author is happy to volunteer for any organization.</w:t>
+        <w:t xml:space="preserve">This is an independent, free, learning-only student project. It respects every company and vendor. Trademarks belong to their owners. It is not affiliated with or endorsed by Amazon Web Services, Cisco, Genesys, Salesforce, Twilio, or any other company. If you have a concern, the page will be removed or corrected promptly through the contact form. Nothing here is sold. There are no ads. The author is happy to volunteer for any organization.</w:t>
       </w:r>
     </w:p>
     <w:p>
@@ -145,6 +145,42 @@
     <w:p>
       <w:r>
         <w:rPr/>
+        <w:t xml:space="preserve">Proficiencies filter inside a queue</w:t>
+      </w:r>
+    </w:p>
+    <w:p>
+      <w:r>
+        <w:rPr/>
+        <w:t xml:space="preserve">Proficiency routing is documented for voice, chat, task, and email.</w:t>
+      </w:r>
+    </w:p>
+    <w:p>
+      <w:r>
+        <w:rPr/>
+        <w:t xml:space="preserve">AND and OR are the Boolean operators. Comparison is &gt;=, or a range of levels from 1 to 5.</w:t>
+      </w:r>
+    </w:p>
+    <w:p>
+      <w:r>
+        <w:rPr/>
+        <w:t xml:space="preserve">The same attribute cannot appear more than once in one expression.</w:t>
+      </w:r>
+    </w:p>
+    <w:p>
+      <w:r>
+        <w:rPr/>
+        <w:t xml:space="preserve">A custom predefined-attribute name cannot start with aws: or connect:.</w:t>
+      </w:r>
+    </w:p>
+    <w:p>
+      <w:r>
+        <w:rPr/>
+        <w:t xml:space="preserve">Caution: Deleting the queue because a proficiency should be enough. The criteria never runs until the contact is in a queue.</w:t>
+      </w:r>
+    </w:p>
+    <w:p>
+      <w:r>
+        <w:rPr/>
         <w:t xml:space="preserve">Sources and go deeper</w:t>
       </w:r>
     </w:p>
@@ -176,6 +212,24 @@
       <w:r>
         <w:rPr/>
         <w:t xml:space="preserve">Automatic call distributor - Wikipedia (Wikipedia) https://en.wikipedia.org/wiki/Automatic_call_distributor last checked 2026-10</w:t>
+      </w:r>
+    </w:p>
+    <w:p>
+      <w:r>
+        <w:rPr/>
+        <w:t xml:space="preserve">Set up routing in Connect Customer based on agent proficiencies - Amazon Connect Customer (AWS docs) https://docs.aws.amazon.com/connect/latest/adminguide/proficiency-routing.html last checked 2026-10</w:t>
+      </w:r>
+    </w:p>
+    <w:p>
+      <w:r>
+        <w:rPr/>
+        <w:t xml:space="preserve">Flow block in Connect Customer: Set routing criteria - Amazon Connect Customer (AWS docs) https://docs.aws.amazon.com/connect/latest/adminguide/set-routing-criteria.html last checked 2026-10</w:t>
+      </w:r>
+    </w:p>
+    <w:p>
+      <w:r>
+        <w:rPr/>
+        <w:t xml:space="preserve">Create a routing profile in Connect Customer to link queues to agents - Amazon Connect Customer (AWS docs) https://docs.aws.amazon.com/connect/latest/adminguide/routing-profiles.html last checked 2026-10</w:t>
       </w:r>
     </w:p>
   </w:body>

</xml_diff>